<commit_message>
change prompts and code accordingly
</commit_message>
<xml_diff>
--- a/Explanations/ChatGPTPrompts.docx
+++ b/Explanations/ChatGPTPrompts.docx
@@ -8,11 +8,41 @@
           <w:lang w:val="en-US"/>
         </w:rPr>
       </w:pPr>
-      <w:r>
+      <w:hyperlink r:id="rId5" w:history="1">
+        <w:r>
+          <w:rPr>
+            <w:rStyle w:val="Hyperlink"/>
+            <w:lang w:val="en-US"/>
+          </w:rPr>
+          <w:t>https://chatgpt.com/share/6891c9bb-a8a4-8009-b3fc-1e7ba5d328bc</w:t>
+        </w:r>
+      </w:hyperlink>
+    </w:p>
+    <w:p>
+      <w:pPr>
+        <w:rPr>
+          <w:b/>
+          <w:bCs/>
+          <w:lang w:val="en-US"/>
+        </w:rPr>
+      </w:pPr>
+      <w:r>
+        <w:rPr>
+          <w:b/>
+          <w:bCs/>
+          <w:lang w:val="en-US"/>
+        </w:rPr>
+        <w:t>You said:</w:t>
+      </w:r>
+    </w:p>
+    <w:p>
+      <w:pPr>
         <w:rPr>
           <w:lang w:val="en-US"/>
         </w:rPr>
-        <w:t>https://chatgpt.com/share/6891c9bb-a8a4-8009-b3fc-1e7ba5d328bc</w:t>
+      </w:pPr>
+      <w:r>
+        <w:t>Consider the following case: We consider the case where Parent B not only has a bad relationship with the child but also hit the child once in a conflict. Parent A, when the deterioration of the marriage seemed to be final, decided to move away with the child without the consent of Parent B. The child declared their wish to live with Parent A, and they have a good relationship. Formalize this case into ASP code, which is of the following form: parent(P) % Defines the parents props(X) % Defines the properties hasProp(P,X) % Defines that parent P has property X goodness(X) % States that property X is good badness(X) % States that property X is bad Do not add any other rules.</w:t>
       </w:r>
     </w:p>
     <w:p>
@@ -20,784 +50,267 @@
         <w:rPr>
           <w:b/>
           <w:bCs/>
+          <w:lang w:val="en-US"/>
         </w:rPr>
       </w:pPr>
       <w:r>
         <w:rPr>
           <w:b/>
           <w:bCs/>
+          <w:lang w:val="en-US"/>
         </w:rPr>
-        <w:t>Chat history</w:t>
-      </w:r>
-    </w:p>
-    <w:p>
-      <w:pPr>
+        <w:t>ChatGPT</w:t>
+      </w:r>
+      <w:r>
         <w:rPr>
           <w:b/>
           <w:bCs/>
+          <w:lang w:val="en-US"/>
         </w:rPr>
-      </w:pPr>
-      <w:r>
+        <w:t xml:space="preserve"> said:</w:t>
+      </w:r>
+    </w:p>
+    <w:p>
+      <w:pPr>
+        <w:rPr>
+          <w:lang w:val="en-US"/>
+        </w:rPr>
+      </w:pPr>
+      <w:r>
+        <w:t>parent(a).</w:t>
+      </w:r>
+      <w:r>
+        <w:br/>
+        <w:t>parent(b).</w:t>
+      </w:r>
+      <w:r>
+        <w:br/>
+      </w:r>
+      <w:r>
+        <w:br/>
+        <w:t>props(badRelationshipWithChild).</w:t>
+      </w:r>
+      <w:r>
+        <w:br/>
+        <w:t>props(hitChildOnceInConflict).</w:t>
+      </w:r>
+      <w:r>
+        <w:br/>
+        <w:t>props(movedAwayWithChildWithoutConsent).</w:t>
+      </w:r>
+      <w:r>
+        <w:br/>
+        <w:t>props(childWantsToLiveWithParent).</w:t>
+      </w:r>
+      <w:r>
+        <w:br/>
+        <w:t>props(goodRelationshipWithChild).</w:t>
+      </w:r>
+      <w:r>
+        <w:br/>
+      </w:r>
+      <w:r>
+        <w:br/>
+        <w:t>hasProp(b, badRelationshipWithChild).</w:t>
+      </w:r>
+      <w:r>
+        <w:br/>
+        <w:t>hasProp(b, hitChildOnceInConflict).</w:t>
+      </w:r>
+      <w:r>
+        <w:br/>
+      </w:r>
+      <w:r>
+        <w:br/>
+        <w:t>hasProp(a, movedAwayWithChildWithoutConsent).</w:t>
+      </w:r>
+      <w:r>
+        <w:br/>
+        <w:t>hasProp(a, childWantsToLiveWithParent).</w:t>
+      </w:r>
+      <w:r>
+        <w:br/>
+        <w:t>hasProp(a, goodRelationshipWithChild).</w:t>
+      </w:r>
+      <w:r>
+        <w:br/>
+      </w:r>
+      <w:r>
+        <w:br/>
+        <w:t>goodness(childWantsToLiveWithParent).</w:t>
+      </w:r>
+      <w:r>
+        <w:br/>
+        <w:t>goodness(goodRelationshipWithChild).</w:t>
+      </w:r>
+      <w:r>
+        <w:br/>
+      </w:r>
+      <w:r>
+        <w:br/>
+        <w:t>badness(badRelationshipWithChild).</w:t>
+      </w:r>
+      <w:r>
+        <w:br/>
+        <w:t>badness(hitChildOnceInConflict).</w:t>
+      </w:r>
+      <w:r>
+        <w:br/>
+        <w:t>badness(movedAwayWithChildWithoutConsent).</w:t>
+      </w:r>
+    </w:p>
+    <w:p>
+      <w:pPr>
         <w:rPr>
           <w:b/>
           <w:bCs/>
+          <w:lang w:val="en-US"/>
         </w:rPr>
-        <w:t>You said:</w:t>
-      </w:r>
-    </w:p>
-    <w:p>
-      <w:r>
-        <w:t xml:space="preserve">Consider the following case: In this case, both parents are capable of raising children appropriately. Where differences can be found are the following: Parent B does not have a good relationship with the child (actually hit him once in a conflict). The child has a good relationship with Parent A; additionally, the child declared their wish to live with this parent. Parent A, when the deterioration of the marriage seemed to be final, decided to move first to Austria, then to Germany with the child without the consent of Parent B. Formalize this case into ASP code, which is of the following form: parent(P) % Defines the parents props(X) % Defines the properties hasProp(P,X) % Defines that parent P has property X goodness(X) % States that property X is good badness(X) % States that property X is bad Do not add any other rules. Find all properties in the given text. </w:t>
-      </w:r>
-    </w:p>
-    <w:p>
-      <w:pPr>
+      </w:pPr>
+      <w:r>
         <w:rPr>
           <w:b/>
           <w:bCs/>
+          <w:lang w:val="en-US"/>
         </w:rPr>
-      </w:pPr>
-      <w:r>
+        <w:t>You said:</w:t>
+      </w:r>
+    </w:p>
+    <w:p>
+      <w:r>
+        <w:t>The assessment of the judge is as follows: Even though it is very bad that Parent B hit the child, the judge at the court of the first instance found that moving abroad was not only illegal but also exceptionally estranging the child from Parent B. While the child declared his wish to live with Parent A, the judge found that this is due to this conscious estrangement, hence not to be taken seriously and thus granted full custody to Parent B. Add to the previous ASP file, each property just defined as either falling into the category not so important (unimp), important (imp) or very important (veryimp), expressed in the form, e.g. catProp(X,Y) where X is a property and Y a category. Then, add choose(P) for which parent P the judge gave custody to.</w:t>
+      </w:r>
+    </w:p>
+    <w:p>
+      <w:pPr>
         <w:rPr>
           <w:b/>
           <w:bCs/>
+          <w:lang w:val="en-US"/>
         </w:rPr>
-        <w:t>ChatGPT said:</w:t>
-      </w:r>
-    </w:p>
-    <w:p>
-      <w:r>
-        <w:t>Here is the formalization of the case into ASP code, extracting </w:t>
-      </w:r>
+      </w:pPr>
       <w:r>
         <w:rPr>
           <w:b/>
           <w:bCs/>
+          <w:lang w:val="en-US"/>
         </w:rPr>
-        <w:t>only the properties explicitly mentioned in the text</w:t>
-      </w:r>
-      <w:r>
-        <w:t> and categorizing them as good or bad where appropriate:</w:t>
+        <w:t>ChatGPT said:</w:t>
       </w:r>
     </w:p>
     <w:p>
       <w:r>
-        <w:t xml:space="preserve">parent(a). parent(b). props(capable_of_raising_children). props(good_relationship_with_child). props(bad_relationship_with_child). props(hit_child_once). props(child_wants_to_live_with_parent). props(moved_without_consent). hasProp(a, capable_of_raising_children). hasProp(a, good_relationship_with_child). hasProp(a, child_wants_to_live_with_parent). hasProp(a, moved_without_consent). hasProp(b, capable_of_raising_children). hasProp(b, bad_relationship_with_child). hasProp(b, hit_child_once). goodness(capable_of_raising_children). goodness(good_relationship_with_child). goodness(child_wants_to_live_with_parent). badness(bad_relationship_with_child). badness(hit_child_once). badness(moved_without_consent). </w:t>
-      </w:r>
-    </w:p>
-    <w:p>
-      <w:pPr>
-        <w:rPr>
-          <w:b/>
-          <w:bCs/>
-        </w:rPr>
-      </w:pPr>
-      <w:r>
-        <w:rPr>
-          <w:b/>
-          <w:bCs/>
-        </w:rPr>
-        <w:t>Notes:</w:t>
-      </w:r>
-    </w:p>
-    <w:p>
-      <w:pPr>
-        <w:numPr>
-          <w:ilvl w:val="0"/>
-          <w:numId w:val="6"/>
-        </w:numPr>
-      </w:pPr>
-      <w:r>
-        <w:rPr>
-          <w:b/>
-          <w:bCs/>
-        </w:rPr>
-        <w:t>Properties</w:t>
-      </w:r>
-      <w:r>
-        <w:t> are derived directly from the case description.</w:t>
-      </w:r>
-    </w:p>
-    <w:p>
-      <w:pPr>
-        <w:numPr>
-          <w:ilvl w:val="0"/>
-          <w:numId w:val="6"/>
-        </w:numPr>
-      </w:pPr>
-      <w:r>
-        <w:rPr>
-          <w:b/>
-          <w:bCs/>
-        </w:rPr>
-        <w:t>No inference or new rules</w:t>
-      </w:r>
-      <w:r>
-        <w:t> have been added beyond what the case states.</w:t>
-      </w:r>
-    </w:p>
-    <w:p>
-      <w:pPr>
-        <w:numPr>
-          <w:ilvl w:val="0"/>
-          <w:numId w:val="6"/>
-        </w:numPr>
-      </w:pPr>
-      <w:r>
-        <w:t>The labels like a and b represent </w:t>
-      </w:r>
-      <w:r>
-        <w:rPr>
-          <w:b/>
-          <w:bCs/>
-        </w:rPr>
-        <w:t>Parent A</w:t>
-      </w:r>
-      <w:r>
-        <w:t> and </w:t>
-      </w:r>
-      <w:r>
-        <w:rPr>
-          <w:b/>
-          <w:bCs/>
-        </w:rPr>
-        <w:t>Parent B</w:t>
-      </w:r>
-      <w:r>
-        <w:t>, respectively.</w:t>
-      </w:r>
-    </w:p>
-    <w:p>
-      <w:pPr>
-        <w:rPr>
-          <w:b/>
-          <w:bCs/>
-        </w:rPr>
-      </w:pPr>
-      <w:r>
-        <w:rPr>
-          <w:b/>
-          <w:bCs/>
-        </w:rPr>
-        <w:t>You said:</w:t>
-      </w:r>
-    </w:p>
-    <w:p>
-      <w:r>
-        <w:t xml:space="preserve">The assessment of the judge is as follows: Even though it is very bad that Parent B hit the child, the judge at the court of the first instance found that moving abroad was not only illegal but also exceptionally estranging the child from Parent B. While the child declared his wish to live with Parent A, the judge found that this is due to this conscious estrangement, hence not to be taken seriously and thus granted full custody to Parent B. Add to the previous ASP file, each property just defined as either falling into the category not so important (unimp), important (imp) or very important (veryimp), expressed in the form, e.g. catProp(X,Y) where X is a property and Y a category. Then, add choose(P) for which parent P the judge gave custody to. </w:t>
-      </w:r>
-    </w:p>
-    <w:p>
-      <w:pPr>
-        <w:rPr>
-          <w:b/>
-          <w:bCs/>
-        </w:rPr>
-      </w:pPr>
-      <w:r>
-        <w:rPr>
-          <w:b/>
-          <w:bCs/>
-        </w:rPr>
-        <w:t>ChatGPT said:</w:t>
-      </w:r>
-    </w:p>
-    <w:p>
-      <w:r>
         <w:lastRenderedPageBreak/>
-        <w:t>Based on the judge’s assessment, we can categorize each property by importance as follows:</w:t>
-      </w:r>
-    </w:p>
-    <w:p>
-      <w:pPr>
-        <w:numPr>
-          <w:ilvl w:val="0"/>
-          <w:numId w:val="7"/>
-        </w:numPr>
-      </w:pPr>
-      <w:r>
-        <w:rPr>
-          <w:b/>
-          <w:bCs/>
-        </w:rPr>
-        <w:t>Hitting the child</w:t>
-      </w:r>
-      <w:r>
-        <w:t> is considered </w:t>
-      </w:r>
-      <w:r>
-        <w:rPr>
-          <w:i/>
-          <w:iCs/>
-        </w:rPr>
-        <w:t>very bad</w:t>
-      </w:r>
-      <w:r>
-        <w:t> — but the judge </w:t>
-      </w:r>
-      <w:r>
-        <w:rPr>
-          <w:i/>
-          <w:iCs/>
-        </w:rPr>
-        <w:t>acknowledges it</w:t>
-      </w:r>
-      <w:r>
-        <w:t> without letting it outweigh other factors.</w:t>
-      </w:r>
-    </w:p>
-    <w:p>
-      <w:pPr>
-        <w:numPr>
-          <w:ilvl w:val="0"/>
-          <w:numId w:val="7"/>
-        </w:numPr>
-      </w:pPr>
-      <w:r>
-        <w:rPr>
-          <w:b/>
-          <w:bCs/>
-        </w:rPr>
-        <w:t>Moving abroad without consent</w:t>
-      </w:r>
-      <w:r>
-        <w:t> is considered </w:t>
-      </w:r>
-      <w:r>
-        <w:rPr>
-          <w:b/>
-          <w:bCs/>
-        </w:rPr>
-        <w:t>illegal</w:t>
-      </w:r>
-      <w:r>
-        <w:t> and </w:t>
-      </w:r>
-      <w:r>
-        <w:rPr>
-          <w:b/>
-          <w:bCs/>
-        </w:rPr>
-        <w:t>estranging</w:t>
-      </w:r>
-      <w:r>
-        <w:t>, and is treated as </w:t>
-      </w:r>
-      <w:r>
-        <w:rPr>
-          <w:b/>
-          <w:bCs/>
-        </w:rPr>
-        <w:t>very important</w:t>
-      </w:r>
-      <w:r>
-        <w:t>.</w:t>
-      </w:r>
-    </w:p>
-    <w:p>
-      <w:pPr>
-        <w:numPr>
-          <w:ilvl w:val="0"/>
-          <w:numId w:val="7"/>
-        </w:numPr>
-      </w:pPr>
-      <w:r>
-        <w:t>The </w:t>
-      </w:r>
-      <w:r>
-        <w:rPr>
-          <w:b/>
-          <w:bCs/>
-        </w:rPr>
-        <w:t>child’s wish</w:t>
-      </w:r>
-      <w:r>
-        <w:t> is invalidated by the judge due to presumed manipulation (estrangement), so its importance is </w:t>
-      </w:r>
-      <w:r>
-        <w:rPr>
-          <w:b/>
-          <w:bCs/>
-        </w:rPr>
-        <w:t>downgraded</w:t>
-      </w:r>
-      <w:r>
-        <w:t>.</w:t>
-      </w:r>
-    </w:p>
-    <w:p>
-      <w:pPr>
-        <w:numPr>
-          <w:ilvl w:val="0"/>
-          <w:numId w:val="7"/>
-        </w:numPr>
-      </w:pPr>
-      <w:r>
-        <w:t>The </w:t>
-      </w:r>
-      <w:r>
-        <w:rPr>
-          <w:b/>
-          <w:bCs/>
-        </w:rPr>
-        <w:t>good/bad relationship</w:t>
-      </w:r>
-      <w:r>
-        <w:t> is still relevant but likely deemed </w:t>
-      </w:r>
-      <w:r>
-        <w:rPr>
-          <w:b/>
-          <w:bCs/>
-        </w:rPr>
-        <w:t>less important</w:t>
-      </w:r>
-      <w:r>
-        <w:t> than the legal/estrangement factor.</w:t>
-      </w:r>
-    </w:p>
-    <w:p>
-      <w:pPr>
-        <w:numPr>
-          <w:ilvl w:val="0"/>
-          <w:numId w:val="7"/>
-        </w:numPr>
-      </w:pPr>
-      <w:r>
-        <w:rPr>
-          <w:b/>
-          <w:bCs/>
-        </w:rPr>
-        <w:t>Capability to raise children</w:t>
-      </w:r>
-      <w:r>
-        <w:t> is likely </w:t>
-      </w:r>
-      <w:r>
-        <w:rPr>
-          <w:i/>
-          <w:iCs/>
-        </w:rPr>
-        <w:t>baseline expected</w:t>
-      </w:r>
-      <w:r>
-        <w:t> and doesn’t decide the case.</w:t>
-      </w:r>
-    </w:p>
-    <w:p>
-      <w:r>
-        <w:t>Here’s the extended ASP file with the new catProp and choose(P) facts:</w:t>
-      </w:r>
-    </w:p>
-    <w:p>
-      <w:r>
-        <w:t xml:space="preserve">parent(a). parent(b). props(capable_of_raising_children). props(good_relationship_with_child). props(bad_relationship_with_child). props(hit_child_once). props(child_wants_to_live_with_parent). props(moved_without_consent). hasProp(a, capable_of_raising_children). hasProp(a, good_relationship_with_child). hasProp(a, child_wants_to_live_with_parent). hasProp(a, moved_without_consent). hasProp(b, capable_of_raising_children). hasProp(b, bad_relationship_with_child). hasProp(b, hit_child_once). goodness(capable_of_raising_children). goodness(good_relationship_with_child). goodness(child_wants_to_live_with_parent). badness(bad_relationship_with_child). badness(hit_child_once). badness(moved_without_consent). catProp(capable_of_raising_children, unimp). catProp(good_relationship_with_child, imp). catProp(bad_relationship_with_child, imp). catProp(hit_child_once, veryimp). catProp(child_wants_to_live_with_parent, unimp). catProp(moved_without_consent, veryimp). choose(b). </w:t>
-      </w:r>
-    </w:p>
-    <w:p>
-      <w:pPr>
-        <w:rPr>
-          <w:b/>
-          <w:bCs/>
-        </w:rPr>
-      </w:pPr>
-      <w:r>
-        <w:rPr>
-          <w:b/>
-          <w:bCs/>
-        </w:rPr>
-        <w:t>Summary:</w:t>
-      </w:r>
-    </w:p>
-    <w:p>
-      <w:pPr>
-        <w:numPr>
-          <w:ilvl w:val="0"/>
-          <w:numId w:val="8"/>
-        </w:numPr>
-      </w:pPr>
-      <w:r>
-        <w:t>The </w:t>
-      </w:r>
-      <w:r>
-        <w:rPr>
-          <w:b/>
-          <w:bCs/>
-        </w:rPr>
-        <w:t>judge's decision</w:t>
-      </w:r>
-      <w:r>
-        <w:t> is represented by choose(b).</w:t>
-      </w:r>
-    </w:p>
-    <w:p>
-      <w:pPr>
-        <w:numPr>
-          <w:ilvl w:val="0"/>
-          <w:numId w:val="8"/>
-        </w:numPr>
-      </w:pPr>
-      <w:r>
-        <w:t>Importance levels are assigned reflecting the </w:t>
-      </w:r>
-      <w:r>
-        <w:rPr>
-          <w:b/>
-          <w:bCs/>
-        </w:rPr>
-        <w:t>court's reasoning</w:t>
-      </w:r>
-      <w:r>
-        <w:t>, not a neutral assessment.</w:t>
-      </w:r>
-    </w:p>
-    <w:p>
-      <w:pPr>
-        <w:numPr>
-          <w:ilvl w:val="0"/>
-          <w:numId w:val="8"/>
-        </w:numPr>
-      </w:pPr>
-      <w:r>
-        <w:t>This ASP code now reflects </w:t>
-      </w:r>
-      <w:r>
-        <w:rPr>
-          <w:b/>
-          <w:bCs/>
-        </w:rPr>
-        <w:t>properties, evaluations (good/bad), importance, and outcome</w:t>
-      </w:r>
-      <w:r>
-        <w:t> strictly based on the described facts.</w:t>
-      </w:r>
-    </w:p>
-    <w:p>
-      <w:pPr>
-        <w:rPr>
-          <w:b/>
-          <w:bCs/>
-        </w:rPr>
-      </w:pPr>
-      <w:r>
-        <w:rPr>
-          <w:b/>
-          <w:bCs/>
-        </w:rPr>
-        <w:t>You said:</w:t>
-      </w:r>
-    </w:p>
-    <w:p>
-      <w:r>
-        <w:t xml:space="preserve">The assessment of the appeal judge is as follows: Parent A appealed the ruling of the first instance. The appeal court reevaluated the situation and found that the first judge had given unjustifiedly great weight to the move and the implied estrangement not evaluating the properly the opinion of the child himself who is old enough to have a reliable opinion immune to significant manipulation, having an established point of view in which the bad behavior of Parent B rather played a role. Hence, the appeal judge granted full custody to Parent A, overwriting the first judgment. Remove the the assessment of the previous judge from the ASP file, and add that of the appeal judge. </w:t>
-      </w:r>
-    </w:p>
-    <w:p>
-      <w:pPr>
-        <w:rPr>
-          <w:b/>
-          <w:bCs/>
-        </w:rPr>
-      </w:pPr>
-      <w:r>
-        <w:rPr>
-          <w:b/>
-          <w:bCs/>
-        </w:rPr>
-        <w:t>ChatGPT said:</w:t>
-      </w:r>
-    </w:p>
-    <w:p>
-      <w:r>
-        <w:lastRenderedPageBreak/>
-        <w:t>Below is the </w:t>
-      </w:r>
-      <w:r>
-        <w:rPr>
-          <w:b/>
-          <w:bCs/>
-        </w:rPr>
-        <w:t>updated ASP file</w:t>
-      </w:r>
-      <w:r>
-        <w:t>, incorporating the </w:t>
-      </w:r>
-      <w:r>
-        <w:rPr>
-          <w:b/>
-          <w:bCs/>
-        </w:rPr>
-        <w:t>appeal judge's assessment</w:t>
-      </w:r>
-      <w:r>
-        <w:t> and </w:t>
-      </w:r>
-      <w:r>
-        <w:rPr>
-          <w:b/>
-          <w:bCs/>
-        </w:rPr>
-        <w:t>removing</w:t>
-      </w:r>
-      <w:r>
-        <w:t> the previous (first instance) judgment:</w:t>
-      </w:r>
-    </w:p>
-    <w:p>
-      <w:pPr>
-        <w:rPr>
-          <w:b/>
-          <w:bCs/>
-        </w:rPr>
-      </w:pPr>
-      <w:r>
-        <w:rPr>
-          <w:b/>
-          <w:bCs/>
-        </w:rPr>
-        <w:t>Key Changes:</w:t>
-      </w:r>
-    </w:p>
-    <w:p>
-      <w:pPr>
-        <w:numPr>
-          <w:ilvl w:val="0"/>
-          <w:numId w:val="9"/>
-        </w:numPr>
-      </w:pPr>
-      <w:r>
-        <w:rPr>
-          <w:b/>
-          <w:bCs/>
-        </w:rPr>
-        <w:t>Updated importance levels</w:t>
-      </w:r>
-      <w:r>
-        <w:t>:</w:t>
-      </w:r>
-    </w:p>
-    <w:p>
-      <w:pPr>
-        <w:numPr>
-          <w:ilvl w:val="1"/>
-          <w:numId w:val="9"/>
-        </w:numPr>
-      </w:pPr>
-      <w:r>
-        <w:t>The </w:t>
-      </w:r>
-      <w:r>
-        <w:rPr>
-          <w:b/>
-          <w:bCs/>
-        </w:rPr>
-        <w:t>child’s wish</w:t>
-      </w:r>
-      <w:r>
-        <w:t> is now </w:t>
-      </w:r>
-      <w:r>
-        <w:rPr>
-          <w:b/>
-          <w:bCs/>
-        </w:rPr>
-        <w:t>very important</w:t>
-      </w:r>
-      <w:r>
-        <w:t>, based on the appeal judge’s assessment.</w:t>
-      </w:r>
-    </w:p>
-    <w:p>
-      <w:pPr>
-        <w:numPr>
-          <w:ilvl w:val="1"/>
-          <w:numId w:val="9"/>
-        </w:numPr>
-      </w:pPr>
-      <w:r>
-        <w:t>The </w:t>
-      </w:r>
-      <w:r>
-        <w:rPr>
-          <w:b/>
-          <w:bCs/>
-        </w:rPr>
-        <w:t>move abroad</w:t>
-      </w:r>
-      <w:r>
-        <w:t> and the estrangement are no longer considered </w:t>
-      </w:r>
-      <w:r>
-        <w:rPr>
-          <w:b/>
-          <w:bCs/>
-        </w:rPr>
-        <w:t>very important</w:t>
-      </w:r>
-      <w:r>
-        <w:t>, but rather downgraded to </w:t>
-      </w:r>
-      <w:r>
-        <w:rPr>
-          <w:b/>
-          <w:bCs/>
-        </w:rPr>
-        <w:t>important</w:t>
-      </w:r>
-      <w:r>
-        <w:t> or even </w:t>
-      </w:r>
-      <w:r>
-        <w:rPr>
-          <w:b/>
-          <w:bCs/>
-        </w:rPr>
-        <w:t>unimportant</w:t>
-      </w:r>
-      <w:r>
-        <w:t>, as their previous weight was “unjustified.”</w:t>
-      </w:r>
-    </w:p>
-    <w:p>
-      <w:pPr>
-        <w:numPr>
-          <w:ilvl w:val="0"/>
-          <w:numId w:val="9"/>
-        </w:numPr>
-      </w:pPr>
-      <w:r>
-        <w:rPr>
-          <w:b/>
-          <w:bCs/>
-        </w:rPr>
-        <w:t>Custody</w:t>
-      </w:r>
-      <w:r>
-        <w:t> is now granted to </w:t>
-      </w:r>
-      <w:r>
-        <w:rPr>
-          <w:b/>
-          <w:bCs/>
-        </w:rPr>
-        <w:t>Parent A</w:t>
-      </w:r>
-      <w:r>
-        <w:t>.</w:t>
-      </w:r>
-    </w:p>
-    <w:p>
-      <w:r>
-        <w:t xml:space="preserve">parent(a). parent(b). props(capable_of_raising_children). props(good_relationship_with_child). props(bad_relationship_with_child). props(hit_child_once). props(child_wants_to_live_with_parent). props(moved_without_consent). hasProp(a, capable_of_raising_children). hasProp(a, good_relationship_with_child). hasProp(a, child_wants_to_live_with_parent). hasProp(a, moved_without_consent). hasProp(b, capable_of_raising_children). hasProp(b, bad_relationship_with_child). hasProp(b, hit_child_once). goodness(capable_of_raising_children). goodness(good_relationship_with_child). goodness(child_wants_to_live_with_parent). badness(bad_relationship_with_child). badness(hit_child_once). badness(moved_without_consent). catProp(capable_of_raising_children, unimp). catProp(good_relationship_with_child, imp). catProp(bad_relationship_with_child, imp). catProp(hit_child_once, veryimp). catProp(child_wants_to_live_with_parent, veryimp). catProp(moved_without_consent, unimp). choose(a). </w:t>
-      </w:r>
-    </w:p>
-    <w:p>
-      <w:pPr>
-        <w:rPr>
-          <w:b/>
-          <w:bCs/>
-        </w:rPr>
-      </w:pPr>
-      <w:r>
-        <w:rPr>
-          <w:b/>
-          <w:bCs/>
-        </w:rPr>
-        <w:t>Summary of Adjustments:</w:t>
-      </w:r>
-    </w:p>
-    <w:p>
-      <w:pPr>
-        <w:numPr>
-          <w:ilvl w:val="0"/>
-          <w:numId w:val="10"/>
-        </w:numPr>
-      </w:pPr>
-      <w:r>
-        <w:t>child_wants_to_live_with_parent is </w:t>
-      </w:r>
-      <w:r>
-        <w:rPr>
-          <w:b/>
-          <w:bCs/>
-        </w:rPr>
-        <w:t>upgraded</w:t>
-      </w:r>
-      <w:r>
-        <w:t> to veryimp.</w:t>
-      </w:r>
-    </w:p>
-    <w:p>
-      <w:pPr>
-        <w:numPr>
-          <w:ilvl w:val="0"/>
-          <w:numId w:val="10"/>
-        </w:numPr>
-      </w:pPr>
-      <w:r>
-        <w:t>moved_without_consent is </w:t>
-      </w:r>
-      <w:r>
-        <w:rPr>
-          <w:b/>
-          <w:bCs/>
-        </w:rPr>
-        <w:t>downgraded</w:t>
-      </w:r>
-      <w:r>
-        <w:t> to unimp.</w:t>
-      </w:r>
-    </w:p>
-    <w:p>
-      <w:pPr>
-        <w:numPr>
-          <w:ilvl w:val="0"/>
-          <w:numId w:val="10"/>
-        </w:numPr>
-      </w:pPr>
-      <w:r>
-        <w:t>Custody is now correctly assigned with choose(a) reflecting the </w:t>
-      </w:r>
-      <w:r>
-        <w:rPr>
-          <w:b/>
-          <w:bCs/>
-        </w:rPr>
-        <w:t>appeal judge's ruling</w:t>
-      </w:r>
-      <w:r>
-        <w:t>.</w:t>
-      </w:r>
-    </w:p>
-    <w:p>
-      <w:pPr>
-        <w:rPr>
-          <w:vanish/>
-        </w:rPr>
-      </w:pPr>
-      <w:r>
-        <w:rPr>
-          <w:vanish/>
-        </w:rPr>
-        <w:t>Top of Form</w:t>
-      </w:r>
-    </w:p>
-    <w:p>
-      <w:pPr>
-        <w:rPr>
-          <w:vanish/>
-        </w:rPr>
-      </w:pPr>
-      <w:r>
-        <w:rPr>
-          <w:vanish/>
-        </w:rPr>
-        <w:t>Bottom of Form</w:t>
-      </w:r>
-    </w:p>
-    <w:p>
-      <w:r>
-        <w:t>ChatGPT can make mistakes. Check important info. See Cookie Preferences.</w:t>
+        <w:t>parent(a).</w:t>
+      </w:r>
+      <w:r>
+        <w:br/>
+        <w:t>parent(b).</w:t>
+      </w:r>
+      <w:r>
+        <w:br/>
+      </w:r>
+      <w:r>
+        <w:br/>
+        <w:t>props(badRelationshipWithChild).</w:t>
+      </w:r>
+      <w:r>
+        <w:br/>
+        <w:t>props(hitChildOnceInConflict).</w:t>
+      </w:r>
+      <w:r>
+        <w:br/>
+        <w:t>props(movedAwayWithChildWithoutConsent).</w:t>
+      </w:r>
+      <w:r>
+        <w:br/>
+        <w:t>props(childWantsToLiveWithParent).</w:t>
+      </w:r>
+      <w:r>
+        <w:br/>
+        <w:t>props(goodRelationshipWithChild).</w:t>
+      </w:r>
+      <w:r>
+        <w:br/>
+      </w:r>
+      <w:r>
+        <w:br/>
+        <w:t>hasProp(b, badRelationshipWithChild).</w:t>
+      </w:r>
+      <w:r>
+        <w:br/>
+        <w:t>hasProp(b, hitChildOnceInConflict).</w:t>
+      </w:r>
+      <w:r>
+        <w:br/>
+      </w:r>
+      <w:r>
+        <w:br/>
+        <w:t>hasProp(a, movedAwayWithChildWithoutConsent).</w:t>
+      </w:r>
+      <w:r>
+        <w:br/>
+        <w:t>hasProp(a, childWantsToLiveWithParent).</w:t>
+      </w:r>
+      <w:r>
+        <w:br/>
+        <w:t>hasProp(a, goodRelationshipWithChild).</w:t>
+      </w:r>
+      <w:r>
+        <w:br/>
+      </w:r>
+      <w:r>
+        <w:br/>
+        <w:t>goodness(childWantsToLiveWithParent).</w:t>
+      </w:r>
+      <w:r>
+        <w:br/>
+        <w:t>goodness(goodRelationshipWithChild).</w:t>
+      </w:r>
+      <w:r>
+        <w:br/>
+      </w:r>
+      <w:r>
+        <w:br/>
+        <w:t>badness(badRelationshipWithChild).</w:t>
+      </w:r>
+      <w:r>
+        <w:br/>
+        <w:t>badness(hitChildOnceInConflict).</w:t>
+      </w:r>
+      <w:r>
+        <w:br/>
+        <w:t>badness(movedAwayWithChildWithoutConsent).</w:t>
+      </w:r>
+      <w:r>
+        <w:br/>
+      </w:r>
+      <w:r>
+        <w:br/>
+        <w:t>catProp(badRelationshipWithChild, imp).</w:t>
+      </w:r>
+      <w:r>
+        <w:br/>
+        <w:t>catProp(hitChildOnceInConflict, veryimp).</w:t>
+      </w:r>
+      <w:r>
+        <w:br/>
+        <w:t>catProp(movedAwayWithChildWithoutConsent, veryimp).</w:t>
+      </w:r>
+      <w:r>
+        <w:br/>
+        <w:t>catProp(childWantsToLiveWithParent, unimp).</w:t>
+      </w:r>
+      <w:r>
+        <w:br/>
+        <w:t>catProp(goodRelationshipWithChild, imp).</w:t>
+      </w:r>
+      <w:r>
+        <w:br/>
+      </w:r>
+      <w:r>
+        <w:br/>
+        <w:t>choose(b).</w:t>
       </w:r>
     </w:p>
     <w:p/>

</xml_diff>